<commit_message>
feat: complete Studio S1.4 directory input safety
</commit_message>
<xml_diff>
--- a/docs/Auto-Tune后续研发路线与实施评估_研发执行版_20260821.docx
+++ b/docs/Auto-Tune后续研发路线与实施评估_研发执行版_20260821.docx
@@ -230,7 +230,7 @@
                 <w:color w:val="1F1F1F"/>
                 <w:sz w:val="18"/>
               </w:rPr>
-              <w:t>Auto-Tune Studio v0.2；S1.2与S1.3已验收但尚未提交</w:t>
+              <w:t>Auto-Tune Studio v0.2；S1.2与S1.3已通过PR #4合并main；S1.4已验收待推送</w:t>
             </w:r>
           </w:p>
         </w:tc>
@@ -285,7 +285,7 @@
                 <w:color w:val="1F1F1F"/>
                 <w:sz w:val="18"/>
               </w:rPr>
-              <w:t>396 passed，2条既有 sklearn PCA warning；S1.2真实训练与S1.3安全验收均通过</w:t>
+              <w:t>460 passed，2条既有 sklearn PCA warning；S1.4 Chromium目录安全验收通过</w:t>
             </w:r>
           </w:p>
         </w:tc>
@@ -342,7 +342,7 @@
                 <w:color w:val="1F1F1F"/>
                 <w:sz w:val="18"/>
               </w:rPr>
-              <w:t>S1.2不可变数据集快照与S1.3 API凭据安全完成验收；进入联合提交前检查</w:t>
+              <w:t>S1.4目录输入安全完成验收；遗留ZIP/JSON上传固定410，不再建设ZIP安全提取</w:t>
             </w:r>
           </w:p>
         </w:tc>
@@ -397,7 +397,7 @@
                 <w:color w:val="1F1F1F"/>
                 <w:sz w:val="18"/>
               </w:rPr>
-              <w:t>2026-08-21</w:t>
+              <w:t>2026-08-24</w:t>
             </w:r>
           </w:p>
         </w:tc>
@@ -464,7 +464,7 @@
                 <w:color w:val="1F1F1F"/>
                 <w:sz w:val="21"/>
               </w:rPr>
-              <w:t>Studio S1.2不可变数据集快照与S1.3 API凭据安全均已完成独立验收；按项目负责人要求暂不提交，先完成文档闭环，再进行两批联合提交前检查。Research与Cloud继续保持后置边界。</w:t>
+              <w:t>Studio S1.2与S1.3已通过PR #4合并main；S1.4目录输入安全已完成独立验收，待完成文档闭环后提交推送。下一批进入Studio S2 SQLite与多数据集规格；Research与Cloud继续保持后置边界。</w:t>
             </w:r>
           </w:p>
         </w:tc>
@@ -1556,7 +1556,7 @@
           <w:color w:val="1F1F1F"/>
           <w:sz w:val="20"/>
         </w:rPr>
-        <w:t>Studio S1.1训练日志分层已进入v0.2；Studio S1.2不可变数据集快照与S1.3 API凭据安全已于2026-08-21完成独立验收，当前等待联合提交前检查。</w:t>
+        <w:t>Studio S1.1已进入v0.2；Studio S1.2与S1.3已通过PR #4合并main；Studio S1.4目录输入安全已于2026-08-24完成独立验收。</w:t>
       </w:r>
     </w:p>
     <w:p>
@@ -2006,7 +2006,7 @@
                 <w:color w:val="1F1F1F"/>
                 <w:sz w:val="16"/>
               </w:rPr>
-              <w:t>已验收/待提交</w:t>
+              <w:t>已验收/已合并</w:t>
             </w:r>
           </w:p>
         </w:tc>
@@ -2058,7 +2058,7 @@
                 <w:color w:val="1F1F1F"/>
                 <w:sz w:val="16"/>
               </w:rPr>
-              <w:t>285项测试、真实1 epoch、源不变、复用/损坏拒绝通过</w:t>
+              <w:t>285项测试、真实1 epoch、源不变、复用/损坏拒绝通过；PR #4</w:t>
             </w:r>
           </w:p>
         </w:tc>
@@ -2139,7 +2139,7 @@
                 <w:color w:val="1F1F1F"/>
                 <w:sz w:val="16"/>
               </w:rPr>
-              <w:t>已验收/待提交</w:t>
+              <w:t>已验收/已合并</w:t>
             </w:r>
           </w:p>
         </w:tc>
@@ -2189,7 +2189,7 @@
                 <w:color w:val="1F1F1F"/>
                 <w:sz w:val="16"/>
               </w:rPr>
-              <w:t>396项完整测试；凭据、模拟供应商、Chromium及真实API验收通过</w:t>
+              <w:t>396项完整测试；安全验收通过；PR #4</w:t>
             </w:r>
           </w:p>
         </w:tc>
@@ -2271,7 +2271,7 @@
                 <w:color w:val="1F1F1F"/>
                 <w:sz w:val="16"/>
               </w:rPr>
-              <w:t>待实施</w:t>
+              <w:t>已验收/待推送</w:t>
             </w:r>
           </w:p>
         </w:tc>
@@ -2297,7 +2297,7 @@
                 <w:color w:val="1F1F1F"/>
                 <w:sz w:val="16"/>
               </w:rPr>
-              <w:t>目录成员数、总容量、ZIP解压容量与路径安全</w:t>
+              <w:t>目录成员数、总容量、允许根、链接与路径安全；遗留上传410</w:t>
             </w:r>
           </w:p>
         </w:tc>
@@ -2323,7 +2323,7 @@
                 <w:color w:val="1F1F1F"/>
                 <w:sz w:val="16"/>
               </w:rPr>
-              <w:t>处理前拒绝超限；链接逃逸和越权路径被拦截</w:t>
+              <w:t>460项完整测试；Chromium超限、越界、按钮恢复与错误码通过</w:t>
             </w:r>
           </w:p>
         </w:tc>
@@ -2349,7 +2349,7 @@
                 <w:color w:val="1F1F1F"/>
                 <w:sz w:val="16"/>
               </w:rPr>
-              <w:t>3–6</w:t>
+              <w:t>实际完成</w:t>
             </w:r>
           </w:p>
         </w:tc>
@@ -9688,7 +9688,7 @@
                 <w:color w:val="1F1F1F"/>
                 <w:sz w:val="16"/>
               </w:rPr>
-              <w:t>已验收的不可变DatasetSnapshot</w:t>
+              <w:t>已验收并通过PR #4合并main</w:t>
             </w:r>
           </w:p>
         </w:tc>
@@ -9714,7 +9714,7 @@
                 <w:color w:val="1F1F1F"/>
                 <w:sz w:val="16"/>
               </w:rPr>
-              <w:t>与S1.3联合提交前检查</w:t>
+              <w:t>保持快照兼容边界</w:t>
             </w:r>
           </w:p>
         </w:tc>
@@ -9794,7 +9794,7 @@
                 <w:color w:val="1F1F1F"/>
                 <w:sz w:val="16"/>
               </w:rPr>
-              <w:t>已验收的安全存储、客户配置、端点策略与脱敏</w:t>
+              <w:t>已验收并通过PR #4合并main</w:t>
             </w:r>
           </w:p>
         </w:tc>
@@ -9819,7 +9819,7 @@
                 <w:color w:val="1F1F1F"/>
                 <w:sz w:val="16"/>
               </w:rPr>
-              <w:t>与S1.2联合检查敏感信息和待提交清单</w:t>
+              <w:t>保持凭据与Endpoint安全边界</w:t>
             </w:r>
           </w:p>
         </w:tc>
@@ -9876,7 +9876,7 @@
                 <w:color w:val="1F1F1F"/>
                 <w:sz w:val="16"/>
               </w:rPr>
-              <w:t>Studio S1.4 容量安全</w:t>
+              <w:t>Studio S1.4 目录输入安全</w:t>
             </w:r>
           </w:p>
         </w:tc>
@@ -9902,7 +9902,7 @@
                 <w:color w:val="1F1F1F"/>
                 <w:sz w:val="16"/>
               </w:rPr>
-              <w:t>目录成员数、容量与路径限制</w:t>
+              <w:t>已验收，等待本次提交推送</w:t>
             </w:r>
           </w:p>
         </w:tc>
@@ -9928,7 +9928,7 @@
                 <w:color w:val="1F1F1F"/>
                 <w:sz w:val="16"/>
               </w:rPr>
-              <w:t>超限、链接逃逸和越权路径均在处理前拒绝</w:t>
+              <w:t>保持有界扫描、稳定错误码与遗留上传410</w:t>
             </w:r>
           </w:p>
         </w:tc>
@@ -12367,7 +12367,7 @@
                 <w:color w:val="1F1F1F"/>
                 <w:sz w:val="16"/>
               </w:rPr>
-              <w:t>审查通过、验收通过；未提交、未推送，等待与S1.3联合提交前检查</w:t>
+              <w:t>审查通过、验收通过；已通过PR #4合并main，未新建Release</w:t>
             </w:r>
           </w:p>
         </w:tc>
@@ -12977,7 +12977,7 @@
                 <w:color w:val="1F1F1F"/>
                 <w:sz w:val="16"/>
               </w:rPr>
-              <w:t>审查通过、验收通过；未提交、未推送，等待与S1.2联合提交前检查</w:t>
+              <w:t>审查通过、验收通过；已通过PR #4合并main，未新建Release</w:t>
             </w:r>
           </w:p>
         </w:tc>
@@ -13045,6 +13045,559 @@
                 <w:sz w:val="21"/>
               </w:rPr>
               <w:t>同一台Windows机器、同一系统用户升级通常沿用Credential Manager，无需重新生成供应商Key；换机、换用户、系统重装或凭据库不可恢复时，应在新设备重新录入或轮换Key。密钥不随项目目录、备份包或容器镜像迁移。</w:t>
+            </w:r>
+          </w:p>
+        </w:tc>
+      </w:tr>
+    </w:tbl>
+    <w:p>
+      <w:pPr>
+        <w:spacing w:after="20"/>
+      </w:pPr>
+    </w:p>
+    <w:p>
+      <w:pPr>
+        <w:pStyle w:val="Heading2"/>
+        <w:keepNext/>
+      </w:pPr>
+      <w:r>
+        <w:t>12.5 Studio S1.4完成记录（2026-08-24）</w:t>
+      </w:r>
+    </w:p>
+    <w:tbl>
+      <w:tblPr>
+        <w:tblW w:type="dxa" w:w="9360"/>
+        <w:jc w:val="left"/>
+        <w:tblLayout w:type="fixed"/>
+        <w:tblLook w:firstColumn="1" w:firstRow="1" w:lastColumn="0" w:lastRow="0" w:noHBand="0" w:noVBand="1" w:val="04A0"/>
+        <w:tblInd w:w="120" w:type="dxa"/>
+        <w:tblBorders>
+          <w:top w:val="single" w:sz="4" w:color="B7C9E2"/>
+          <w:left w:val="single" w:sz="4" w:color="B7C9E2"/>
+          <w:bottom w:val="single" w:sz="4" w:color="B7C9E2"/>
+          <w:right w:val="single" w:sz="4" w:color="B7C9E2"/>
+          <w:insideH w:val="single" w:sz="4" w:color="B7C9E2"/>
+          <w:insideV w:val="single" w:sz="4" w:color="B7C9E2"/>
+        </w:tblBorders>
+      </w:tblPr>
+      <w:tblGrid>
+        <w:gridCol w:w="2000"/>
+        <w:gridCol w:w="7360"/>
+      </w:tblGrid>
+      <w:tr>
+        <w:trPr>
+          <w:tblHeader w:val="true"/>
+          <w:cantSplit w:val="true"/>
+        </w:trPr>
+        <w:tc>
+          <w:tcPr>
+            <w:tcW w:type="dxa" w:w="2000"/>
+            <w:shd w:fill="E8EEF5"/>
+            <w:tcMar>
+              <w:top w:w="80" w:type="dxa"/>
+              <w:start w:w="120" w:type="dxa"/>
+              <w:bottom w:w="80" w:type="dxa"/>
+              <w:end w:w="120" w:type="dxa"/>
+            </w:tcMar>
+            <w:vAlign w:val="center"/>
+          </w:tcPr>
+          <w:p>
+            <w:pPr>
+              <w:spacing w:after="0"/>
+            </w:pPr>
+            <w:r>
+              <w:rPr>
+                <w:rFonts w:ascii="Microsoft YaHei" w:hAnsi="Microsoft YaHei" w:eastAsia="Microsoft YaHei"/>
+                <w:b/>
+                <w:color w:val="17365D"/>
+                <w:sz w:val="16"/>
+              </w:rPr>
+              <w:t>项目</w:t>
+            </w:r>
+          </w:p>
+        </w:tc>
+        <w:tc>
+          <w:tcPr>
+            <w:tcW w:type="dxa" w:w="7360"/>
+            <w:shd w:fill="E8EEF5"/>
+            <w:tcMar>
+              <w:top w:w="80" w:type="dxa"/>
+              <w:start w:w="120" w:type="dxa"/>
+              <w:bottom w:w="80" w:type="dxa"/>
+              <w:end w:w="120" w:type="dxa"/>
+            </w:tcMar>
+            <w:vAlign w:val="center"/>
+          </w:tcPr>
+          <w:p>
+            <w:pPr>
+              <w:spacing w:after="0"/>
+            </w:pPr>
+            <w:r>
+              <w:rPr>
+                <w:rFonts w:ascii="Microsoft YaHei" w:hAnsi="Microsoft YaHei" w:eastAsia="Microsoft YaHei"/>
+                <w:b/>
+                <w:color w:val="17365D"/>
+                <w:sz w:val="16"/>
+              </w:rPr>
+              <w:t>实际结果</w:t>
+            </w:r>
+          </w:p>
+        </w:tc>
+      </w:tr>
+      <w:tr>
+        <w:trPr>
+          <w:cantSplit w:val="true"/>
+        </w:trPr>
+        <w:tc>
+          <w:tcPr>
+            <w:tcW w:type="dxa" w:w="2000"/>
+            <w:tcMar>
+              <w:top w:w="80" w:type="dxa"/>
+              <w:start w:w="120" w:type="dxa"/>
+              <w:bottom w:w="80" w:type="dxa"/>
+              <w:end w:w="120" w:type="dxa"/>
+            </w:tcMar>
+            <w:vAlign w:val="center"/>
+          </w:tcPr>
+          <w:p>
+            <w:pPr>
+              <w:spacing w:after="0" w:line="252" w:lineRule="auto"/>
+            </w:pPr>
+            <w:r>
+              <w:rPr>
+                <w:rFonts w:ascii="Microsoft YaHei" w:hAnsi="Microsoft YaHei" w:eastAsia="Microsoft YaHei"/>
+                <w:color w:val="1F1F1F"/>
+                <w:sz w:val="16"/>
+              </w:rPr>
+              <w:t>目录门禁</w:t>
+            </w:r>
+          </w:p>
+        </w:tc>
+        <w:tc>
+          <w:tcPr>
+            <w:tcW w:type="dxa" w:w="7360"/>
+            <w:tcMar>
+              <w:top w:w="80" w:type="dxa"/>
+              <w:start w:w="120" w:type="dxa"/>
+              <w:bottom w:w="80" w:type="dxa"/>
+              <w:end w:w="120" w:type="dxa"/>
+            </w:tcMar>
+            <w:vAlign w:val="center"/>
+          </w:tcPr>
+          <w:p>
+            <w:pPr>
+              <w:spacing w:after="0" w:line="252" w:lineRule="auto"/>
+            </w:pPr>
+            <w:r>
+              <w:rPr>
+                <w:rFonts w:ascii="Microsoft YaHei" w:hAnsi="Microsoft YaHei" w:eastAsia="Microsoft YaHei"/>
+                <w:color w:val="1F1F1F"/>
+                <w:sz w:val="16"/>
+              </w:rPr>
+              <w:t>正式目录入口统一验证绝对路径、允许根、权限、链接/reparse point，并在递归处理前执行成员数与总字节数有界扫描</w:t>
+            </w:r>
+          </w:p>
+        </w:tc>
+      </w:tr>
+      <w:tr>
+        <w:trPr>
+          <w:cantSplit w:val="true"/>
+        </w:trPr>
+        <w:tc>
+          <w:tcPr>
+            <w:tcW w:type="dxa" w:w="2000"/>
+            <w:tcMar>
+              <w:top w:w="80" w:type="dxa"/>
+              <w:start w:w="120" w:type="dxa"/>
+              <w:bottom w:w="80" w:type="dxa"/>
+              <w:end w:w="120" w:type="dxa"/>
+            </w:tcMar>
+            <w:vAlign w:val="center"/>
+            <w:shd w:fill="F8FAFC"/>
+          </w:tcPr>
+          <w:p>
+            <w:pPr>
+              <w:spacing w:after="0" w:line="252" w:lineRule="auto"/>
+            </w:pPr>
+            <w:r>
+              <w:rPr>
+                <w:rFonts w:ascii="Microsoft YaHei" w:hAnsi="Microsoft YaHei" w:eastAsia="Microsoft YaHei"/>
+                <w:color w:val="1F1F1F"/>
+                <w:sz w:val="16"/>
+              </w:rPr>
+              <w:t>遗留上传</w:t>
+            </w:r>
+          </w:p>
+        </w:tc>
+        <w:tc>
+          <w:tcPr>
+            <w:tcW w:type="dxa" w:w="7360"/>
+            <w:tcMar>
+              <w:top w:w="80" w:type="dxa"/>
+              <w:start w:w="120" w:type="dxa"/>
+              <w:bottom w:w="80" w:type="dxa"/>
+              <w:end w:w="120" w:type="dxa"/>
+            </w:tcMar>
+            <w:vAlign w:val="center"/>
+            <w:shd w:fill="F8FAFC"/>
+          </w:tcPr>
+          <w:p>
+            <w:pPr>
+              <w:spacing w:after="0" w:line="252" w:lineRule="auto"/>
+            </w:pPr>
+            <w:r>
+              <w:rPr>
+                <w:rFonts w:ascii="Microsoft YaHei" w:hAnsi="Microsoft YaHei" w:eastAsia="Microsoft YaHei"/>
+                <w:color w:val="1F1F1F"/>
+                <w:sz w:val="16"/>
+              </w:rPr>
+              <w:t>/api/dataset/upload与/api/training/analyze固定返回410 LEGACY_UPLOAD_DISABLED，不读取文件体；旧实现留待后续确认无外部调用后清理</w:t>
+            </w:r>
+          </w:p>
+        </w:tc>
+      </w:tr>
+      <w:tr>
+        <w:trPr>
+          <w:cantSplit w:val="true"/>
+        </w:trPr>
+        <w:tc>
+          <w:tcPr>
+            <w:tcW w:type="dxa" w:w="2000"/>
+            <w:tcMar>
+              <w:top w:w="80" w:type="dxa"/>
+              <w:start w:w="120" w:type="dxa"/>
+              <w:bottom w:w="80" w:type="dxa"/>
+              <w:end w:w="120" w:type="dxa"/>
+            </w:tcMar>
+            <w:vAlign w:val="center"/>
+          </w:tcPr>
+          <w:p>
+            <w:pPr>
+              <w:spacing w:after="0" w:line="252" w:lineRule="auto"/>
+            </w:pPr>
+            <w:r>
+              <w:rPr>
+                <w:rFonts w:ascii="Microsoft YaHei" w:hAnsi="Microsoft YaHei" w:eastAsia="Microsoft YaHei"/>
+                <w:color w:val="1F1F1F"/>
+                <w:sz w:val="16"/>
+              </w:rPr>
+              <w:t>配置与响应</w:t>
+            </w:r>
+          </w:p>
+        </w:tc>
+        <w:tc>
+          <w:tcPr>
+            <w:tcW w:type="dxa" w:w="7360"/>
+            <w:tcMar>
+              <w:top w:w="80" w:type="dxa"/>
+              <w:start w:w="120" w:type="dxa"/>
+              <w:bottom w:w="80" w:type="dxa"/>
+              <w:end w:w="120" w:type="dxa"/>
+            </w:tcMar>
+            <w:vAlign w:val="center"/>
+          </w:tcPr>
+          <w:p>
+            <w:pPr>
+              <w:spacing w:after="0" w:line="252" w:lineRule="auto"/>
+            </w:pPr>
+            <w:r>
+              <w:rPr>
+                <w:rFonts w:ascii="Microsoft YaHei" w:hAnsi="Microsoft YaHei" w:eastAsia="Microsoft YaHei"/>
+                <w:color w:val="1F1F1F"/>
+                <w:sz w:val="16"/>
+              </w:rPr>
+              <w:t>input_safety四字段严格解析；成功响应包含input_scan；安全失败返回稳定HTTP状态与错误码</w:t>
+            </w:r>
+          </w:p>
+        </w:tc>
+      </w:tr>
+      <w:tr>
+        <w:trPr>
+          <w:cantSplit w:val="true"/>
+        </w:trPr>
+        <w:tc>
+          <w:tcPr>
+            <w:tcW w:type="dxa" w:w="2000"/>
+            <w:tcMar>
+              <w:top w:w="80" w:type="dxa"/>
+              <w:start w:w="120" w:type="dxa"/>
+              <w:bottom w:w="80" w:type="dxa"/>
+              <w:end w:w="120" w:type="dxa"/>
+            </w:tcMar>
+            <w:vAlign w:val="center"/>
+            <w:shd w:fill="F8FAFC"/>
+          </w:tcPr>
+          <w:p>
+            <w:pPr>
+              <w:spacing w:after="0" w:line="252" w:lineRule="auto"/>
+            </w:pPr>
+            <w:r>
+              <w:rPr>
+                <w:rFonts w:ascii="Microsoft YaHei" w:hAnsi="Microsoft YaHei" w:eastAsia="Microsoft YaHei"/>
+                <w:color w:val="1F1F1F"/>
+                <w:sz w:val="16"/>
+              </w:rPr>
+              <w:t>自动化</w:t>
+            </w:r>
+          </w:p>
+        </w:tc>
+        <w:tc>
+          <w:tcPr>
+            <w:tcW w:type="dxa" w:w="7360"/>
+            <w:tcMar>
+              <w:top w:w="80" w:type="dxa"/>
+              <w:start w:w="120" w:type="dxa"/>
+              <w:bottom w:w="80" w:type="dxa"/>
+              <w:end w:w="120" w:type="dxa"/>
+            </w:tcMar>
+            <w:vAlign w:val="center"/>
+            <w:shd w:fill="F8FAFC"/>
+          </w:tcPr>
+          <w:p>
+            <w:pPr>
+              <w:spacing w:after="0" w:line="252" w:lineRule="auto"/>
+            </w:pPr>
+            <w:r>
+              <w:rPr>
+                <w:rFonts w:ascii="Microsoft YaHei" w:hAnsi="Microsoft YaHei" w:eastAsia="Microsoft YaHei"/>
+                <w:color w:val="1F1F1F"/>
+                <w:sz w:val="16"/>
+              </w:rPr>
+              <w:t>S1.4定向176 passed；完整460 passed、2条既有PCA warning、0 skipped</w:t>
+            </w:r>
+          </w:p>
+        </w:tc>
+      </w:tr>
+      <w:tr>
+        <w:trPr>
+          <w:cantSplit w:val="true"/>
+        </w:trPr>
+        <w:tc>
+          <w:tcPr>
+            <w:tcW w:type="dxa" w:w="2000"/>
+            <w:tcMar>
+              <w:top w:w="80" w:type="dxa"/>
+              <w:start w:w="120" w:type="dxa"/>
+              <w:bottom w:w="80" w:type="dxa"/>
+              <w:end w:w="120" w:type="dxa"/>
+            </w:tcMar>
+            <w:vAlign w:val="center"/>
+          </w:tcPr>
+          <w:p>
+            <w:pPr>
+              <w:spacing w:after="0" w:line="252" w:lineRule="auto"/>
+            </w:pPr>
+            <w:r>
+              <w:rPr>
+                <w:rFonts w:ascii="Microsoft YaHei" w:hAnsi="Microsoft YaHei" w:eastAsia="Microsoft YaHei"/>
+                <w:color w:val="1F1F1F"/>
+                <w:sz w:val="16"/>
+              </w:rPr>
+              <w:t>浏览器</w:t>
+            </w:r>
+          </w:p>
+        </w:tc>
+        <w:tc>
+          <w:tcPr>
+            <w:tcW w:type="dxa" w:w="7360"/>
+            <w:tcMar>
+              <w:top w:w="80" w:type="dxa"/>
+              <w:start w:w="120" w:type="dxa"/>
+              <w:bottom w:w="80" w:type="dxa"/>
+              <w:end w:w="120" w:type="dxa"/>
+            </w:tcMar>
+            <w:vAlign w:val="center"/>
+          </w:tcPr>
+          <w:p>
+            <w:pPr>
+              <w:spacing w:after="0" w:line="252" w:lineRule="auto"/>
+            </w:pPr>
+            <w:r>
+              <w:rPr>
+                <w:rFonts w:ascii="Microsoft YaHei" w:hAnsi="Microsoft YaHei" w:eastAsia="Microsoft YaHei"/>
+                <w:color w:val="1F1F1F"/>
+                <w:sz w:val="16"/>
+              </w:rPr>
+              <w:t>不存在/越界路径、成员超限、容量超限、浏览禁用、中文错误、稳定错误码、按钮恢复与控制台检查通过</w:t>
+            </w:r>
+          </w:p>
+        </w:tc>
+      </w:tr>
+      <w:tr>
+        <w:trPr>
+          <w:cantSplit w:val="true"/>
+        </w:trPr>
+        <w:tc>
+          <w:tcPr>
+            <w:tcW w:type="dxa" w:w="2000"/>
+            <w:tcMar>
+              <w:top w:w="80" w:type="dxa"/>
+              <w:start w:w="120" w:type="dxa"/>
+              <w:bottom w:w="80" w:type="dxa"/>
+              <w:end w:w="120" w:type="dxa"/>
+            </w:tcMar>
+            <w:vAlign w:val="center"/>
+            <w:shd w:fill="F8FAFC"/>
+          </w:tcPr>
+          <w:p>
+            <w:pPr>
+              <w:spacing w:after="0" w:line="252" w:lineRule="auto"/>
+            </w:pPr>
+            <w:r>
+              <w:rPr>
+                <w:rFonts w:ascii="Microsoft YaHei" w:hAnsi="Microsoft YaHei" w:eastAsia="Microsoft YaHei"/>
+                <w:color w:val="1F1F1F"/>
+                <w:sz w:val="16"/>
+              </w:rPr>
+              <w:t>审查修复</w:t>
+            </w:r>
+          </w:p>
+        </w:tc>
+        <w:tc>
+          <w:tcPr>
+            <w:tcW w:type="dxa" w:w="7360"/>
+            <w:tcMar>
+              <w:top w:w="80" w:type="dxa"/>
+              <w:start w:w="120" w:type="dxa"/>
+              <w:bottom w:w="80" w:type="dxa"/>
+              <w:end w:w="120" w:type="dxa"/>
+            </w:tcMar>
+            <w:vAlign w:val="center"/>
+            <w:shd w:fill="F8FAFC"/>
+          </w:tcPr>
+          <w:p>
+            <w:pPr>
+              <w:spacing w:after="0" w:line="252" w:lineRule="auto"/>
+            </w:pPr>
+            <w:r>
+              <w:rPr>
+                <w:rFonts w:ascii="Microsoft YaHei" w:hAnsi="Microsoft YaHei" w:eastAsia="Microsoft YaHei"/>
+                <w:color w:val="1F1F1F"/>
+                <w:sz w:val="16"/>
+              </w:rPr>
+              <w:t>独立验收发现两个分析入口未展示error_code；按TDD补失败测试后完成最小修复并复验</w:t>
+            </w:r>
+          </w:p>
+        </w:tc>
+      </w:tr>
+      <w:tr>
+        <w:trPr>
+          <w:cantSplit w:val="true"/>
+        </w:trPr>
+        <w:tc>
+          <w:tcPr>
+            <w:tcW w:type="dxa" w:w="2000"/>
+            <w:tcMar>
+              <w:top w:w="80" w:type="dxa"/>
+              <w:start w:w="120" w:type="dxa"/>
+              <w:bottom w:w="80" w:type="dxa"/>
+              <w:end w:w="120" w:type="dxa"/>
+            </w:tcMar>
+            <w:vAlign w:val="center"/>
+          </w:tcPr>
+          <w:p>
+            <w:pPr>
+              <w:spacing w:after="0" w:line="252" w:lineRule="auto"/>
+            </w:pPr>
+            <w:r>
+              <w:rPr>
+                <w:rFonts w:ascii="Microsoft YaHei" w:hAnsi="Microsoft YaHei" w:eastAsia="Microsoft YaHei"/>
+                <w:color w:val="1F1F1F"/>
+                <w:sz w:val="16"/>
+              </w:rPr>
+              <w:t>发布状态</w:t>
+            </w:r>
+          </w:p>
+        </w:tc>
+        <w:tc>
+          <w:tcPr>
+            <w:tcW w:type="dxa" w:w="7360"/>
+            <w:tcMar>
+              <w:top w:w="80" w:type="dxa"/>
+              <w:start w:w="120" w:type="dxa"/>
+              <w:bottom w:w="80" w:type="dxa"/>
+              <w:end w:w="120" w:type="dxa"/>
+            </w:tcMar>
+            <w:vAlign w:val="center"/>
+          </w:tcPr>
+          <w:p>
+            <w:pPr>
+              <w:spacing w:after="0" w:line="252" w:lineRule="auto"/>
+            </w:pPr>
+            <w:r>
+              <w:rPr>
+                <w:rFonts w:ascii="Microsoft YaHei" w:hAnsi="Microsoft YaHei" w:eastAsia="Microsoft YaHei"/>
+                <w:color w:val="1F1F1F"/>
+                <w:sz w:val="16"/>
+              </w:rPr>
+              <w:t>审查通过、验收通过；等待文档闭环、提交与推送</w:t>
+            </w:r>
+          </w:p>
+        </w:tc>
+      </w:tr>
+    </w:tbl>
+    <w:p>
+      <w:pPr>
+        <w:spacing w:before="0" w:after="20" w:line="20" w:lineRule="exact"/>
+      </w:pPr>
+      <w:r>
+        <w:rPr>
+          <w:sz w:val="2"/>
+        </w:rPr>
+        <w:t xml:space="preserve"> </w:t>
+      </w:r>
+    </w:p>
+    <w:tbl>
+      <w:tblPr>
+        <w:tblW w:type="dxa" w:w="9360"/>
+        <w:jc w:val="left"/>
+        <w:tblLayout w:type="fixed"/>
+        <w:tblLook w:firstColumn="1" w:firstRow="1" w:lastColumn="0" w:lastRow="0" w:noHBand="0" w:noVBand="1" w:val="04A0"/>
+        <w:tblInd w:w="120" w:type="dxa"/>
+        <w:tblBorders>
+          <w:top w:val="single" w:sz="1" w:color="FFF2CC"/>
+          <w:left w:val="single" w:sz="1" w:color="FFF2CC"/>
+          <w:bottom w:val="single" w:sz="1" w:color="FFF2CC"/>
+          <w:right w:val="single" w:sz="1" w:color="FFF2CC"/>
+          <w:insideH w:val="single" w:sz="1" w:color="FFF2CC"/>
+          <w:insideV w:val="single" w:sz="1" w:color="FFF2CC"/>
+        </w:tblBorders>
+      </w:tblPr>
+      <w:tblGrid>
+        <w:gridCol w:w="9360"/>
+      </w:tblGrid>
+      <w:tr>
+        <w:tc>
+          <w:tcPr>
+            <w:tcW w:type="dxa" w:w="9360"/>
+            <w:shd w:fill="FFF2CC"/>
+            <w:tcMar>
+              <w:top w:w="140" w:type="dxa"/>
+              <w:start w:w="180" w:type="dxa"/>
+              <w:bottom w:w="140" w:type="dxa"/>
+              <w:end w:w="180" w:type="dxa"/>
+            </w:tcMar>
+          </w:tcPr>
+          <w:p>
+            <w:pPr>
+              <w:spacing w:after="0"/>
+            </w:pPr>
+            <w:r>
+              <w:rPr>
+                <w:rFonts w:ascii="Microsoft YaHei" w:hAnsi="Microsoft YaHei" w:eastAsia="Microsoft YaHei"/>
+                <w:b/>
+                <w:color w:val="17365D"/>
+                <w:sz w:val="21"/>
+              </w:rPr>
+              <w:t>S1.4边界与风险：</w:t>
+            </w:r>
+            <w:r>
+              <w:rPr>
+                <w:rFonts w:ascii="Microsoft YaHei" w:hAnsi="Microsoft YaHei" w:eastAsia="Microsoft YaHei"/>
+                <w:color w:val="1F1F1F"/>
+                <w:sz w:val="21"/>
+              </w:rPr>
+              <w:t>本批不建设ZIP安全提取。扫描成本随成员数线性增长，单层海量条目排序存在内存峰值；allowed_roots为空按设计允许本机绝对路径；扫描结束到后续分析之间仍有文件系统竞态窗口。</w:t>
             </w:r>
           </w:p>
         </w:tc>
@@ -13208,67 +13761,6 @@
         <w:spacing w:after="20"/>
       </w:pPr>
     </w:p>
-    <w:tbl>
-      <w:tblPr>
-        <w:tblW w:type="dxa" w:w="9360"/>
-        <w:jc w:val="left"/>
-        <w:tblLayout w:type="fixed"/>
-        <w:tblLook w:firstColumn="1" w:firstRow="1" w:lastColumn="0" w:lastRow="0" w:noHBand="0" w:noVBand="1" w:val="04A0"/>
-        <w:tblInd w:w="120" w:type="dxa"/>
-        <w:tblBorders>
-          <w:top w:val="single" w:sz="1" w:color="FFF2CC"/>
-          <w:left w:val="single" w:sz="1" w:color="FFF2CC"/>
-          <w:bottom w:val="single" w:sz="1" w:color="FFF2CC"/>
-          <w:right w:val="single" w:sz="1" w:color="FFF2CC"/>
-          <w:insideH w:val="single" w:sz="1" w:color="FFF2CC"/>
-          <w:insideV w:val="single" w:sz="1" w:color="FFF2CC"/>
-        </w:tblBorders>
-      </w:tblPr>
-      <w:tblGrid>
-        <w:gridCol w:w="9360"/>
-      </w:tblGrid>
-      <w:tr>
-        <w:tc>
-          <w:tcPr>
-            <w:tcW w:type="dxa" w:w="9360"/>
-            <w:shd w:fill="FFF2CC"/>
-            <w:tcMar>
-              <w:top w:w="140" w:type="dxa"/>
-              <w:start w:w="180" w:type="dxa"/>
-              <w:bottom w:w="140" w:type="dxa"/>
-              <w:end w:w="180" w:type="dxa"/>
-            </w:tcMar>
-          </w:tcPr>
-          <w:p>
-            <w:pPr>
-              <w:spacing w:after="0"/>
-            </w:pPr>
-            <w:r>
-              <w:rPr>
-                <w:rFonts w:ascii="Microsoft YaHei" w:hAnsi="Microsoft YaHei" w:eastAsia="Microsoft YaHei"/>
-                <w:b/>
-                <w:color w:val="17365D"/>
-                <w:sz w:val="21"/>
-              </w:rPr>
-              <w:t>扩展软件说明：</w:t>
-            </w:r>
-            <w:r>
-              <w:rPr>
-                <w:rFonts w:ascii="Microsoft YaHei" w:hAnsi="Microsoft YaHei" w:eastAsia="Microsoft YaHei"/>
-                <w:color w:val="1F1F1F"/>
-                <w:sz w:val="21"/>
-              </w:rPr>
-              <w:t>Research和Cloud当前内容均可能随业务、数据、模型版本和部署方案变化。Research保留本轮讨论结论作为立项输入；Cloud只做模糊评估，待实施方案确定后再补充架构、批次、人员和详细时间进度。</w:t>
-            </w:r>
-          </w:p>
-        </w:tc>
-      </w:tr>
-    </w:tbl>
-    <w:p>
-      <w:pPr>
-        <w:spacing w:after="20"/>
-      </w:pPr>
-    </w:p>
     <w:sectPr>
       <w:headerReference w:type="default" r:id="rId9"/>
       <w:footerReference w:type="default" r:id="rId10"/>
@@ -13313,7 +13805,7 @@
         <w:color w:val="666666"/>
         <w:sz w:val="17"/>
       </w:rPr>
-      <w:t>AUTO-TUNE 研发执行评估  |  2026-08-21</w:t>
+      <w:t>AUTO-TUNE 研发执行评估  |  2026-08-24</w:t>
     </w:r>
   </w:p>
 </w:hdr>

</xml_diff>

<commit_message>
docs: record Studio S1.4 merge status
</commit_message>
<xml_diff>
--- a/docs/Auto-Tune后续研发路线与实施评估_研发执行版_20260821.docx
+++ b/docs/Auto-Tune后续研发路线与实施评估_研发执行版_20260821.docx
@@ -230,7 +230,7 @@
                 <w:color w:val="1F1F1F"/>
                 <w:sz w:val="18"/>
               </w:rPr>
-              <w:t>Auto-Tune Studio v0.2；S1.2与S1.3已通过PR #4合并main；S1.4已验收待推送</w:t>
+              <w:t>Auto-Tune Studio v0.2；S1.2/S1.3通过PR #4合并main；S1.4通过PR #5合并main</w:t>
             </w:r>
           </w:p>
         </w:tc>
@@ -464,7 +464,7 @@
                 <w:color w:val="1F1F1F"/>
                 <w:sz w:val="21"/>
               </w:rPr>
-              <w:t>Studio S1.2与S1.3已通过PR #4合并main；S1.4目录输入安全已完成独立验收，待完成文档闭环后提交推送。下一批进入Studio S2 SQLite与多数据集规格；Research与Cloud继续保持后置边界。</w:t>
+              <w:t>Studio S1.2与S1.3已通过PR #4合并main；S1.4目录输入安全已通过PR #5合并main。当前稳定Release仍为v0.2。下一批进入Studio S2 SQLite与多数据集规格；Research与Cloud继续保持后置边界。</w:t>
             </w:r>
           </w:p>
         </w:tc>
@@ -2271,7 +2271,7 @@
                 <w:color w:val="1F1F1F"/>
                 <w:sz w:val="16"/>
               </w:rPr>
-              <w:t>已验收/待推送</w:t>
+              <w:t>已验收/已合并</w:t>
             </w:r>
           </w:p>
         </w:tc>
@@ -2323,7 +2323,7 @@
                 <w:color w:val="1F1F1F"/>
                 <w:sz w:val="16"/>
               </w:rPr>
-              <w:t>460项完整测试；Chromium超限、越界、按钮恢复与错误码通过</w:t>
+              <w:t>460项完整测试；Chromium验收通过；PR #5</w:t>
             </w:r>
           </w:p>
         </w:tc>
@@ -9902,7 +9902,7 @@
                 <w:color w:val="1F1F1F"/>
                 <w:sz w:val="16"/>
               </w:rPr>
-              <w:t>已验收，等待本次提交推送</w:t>
+              <w:t>已验收并通过PR #5合并main</w:t>
             </w:r>
           </w:p>
         </w:tc>
@@ -13530,7 +13530,7 @@
                 <w:color w:val="1F1F1F"/>
                 <w:sz w:val="16"/>
               </w:rPr>
-              <w:t>审查通过、验收通过；等待文档闭环、提交与推送</w:t>
+              <w:t>审查通过、验收通过；已通过PR #5合并main，未新建Release</w:t>
             </w:r>
           </w:p>
         </w:tc>

</xml_diff>

<commit_message>
docs: schedule unified Studio S1.5 before S2
</commit_message>
<xml_diff>
--- a/docs/Auto-Tune后续研发路线与实施评估_研发执行版_20260821.docx
+++ b/docs/Auto-Tune后续研发路线与实施评估_研发执行版_20260821.docx
@@ -464,7 +464,7 @@
                 <w:color w:val="1F1F1F"/>
                 <w:sz w:val="21"/>
               </w:rPr>
-              <w:t>Studio S1.2与S1.3已通过PR #4合并main；S1.4目录输入安全已通过PR #5合并main。当前稳定Release仍为v0.2。下一批进入Studio S2 SQLite与多数据集规格；Research与Cloud继续保持后置边界。</w:t>
+              <w:t>Studio S1.2与S1.3已通过PR #4合并main；S1.4目录输入安全已通过PR #5合并main。当前稳定Release仍为v0.2。下一批先完成统一的Studio S1.5运行状态与重连可靠性，再进入S2 SQLite与多数据集；Research与Cloud继续保持后置边界。</w:t>
             </w:r>
           </w:p>
         </w:tc>
@@ -2404,7 +2404,7 @@
                 <w:color w:val="1F1F1F"/>
                 <w:sz w:val="16"/>
               </w:rPr>
-              <w:t>后续</w:t>
+              <w:t>下一批/统一交付</w:t>
             </w:r>
           </w:p>
         </w:tc>
@@ -2429,7 +2429,7 @@
                 <w:color w:val="1F1F1F"/>
                 <w:sz w:val="16"/>
               </w:rPr>
-              <w:t>运行身份、PID、阶段和最后事件持久化</w:t>
+              <w:t>统一普通训练与调优的运行身份和状态；PID校验；阶段/最后事件原子持久化；API、SSE、UI刷新重连</w:t>
             </w:r>
           </w:p>
         </w:tc>
@@ -2454,7 +2454,7 @@
                 <w:color w:val="1F1F1F"/>
                 <w:sz w:val="16"/>
               </w:rPr>
-              <w:t>刷新/重连能说明真实状态，不伪造恢复</w:t>
+              <w:t>旧状态可读；PID复用不误判；异常消失标记中断/未知；不伪造恢复</w:t>
             </w:r>
           </w:p>
         </w:tc>
@@ -2495,6 +2495,439 @@
         </w:rPr>
         <w:t xml:space="preserve"> </w:t>
       </w:r>
+    </w:p>
+    <w:p>
+      <w:pPr>
+        <w:pStyle w:val="Heading3"/>
+        <w:keepNext/>
+      </w:pPr>
+      <w:r>
+        <w:t>3.1.1 S1.5统一批次实施内容</w:t>
+      </w:r>
+    </w:p>
+    <w:tbl>
+      <w:tblPr>
+        <w:tblW w:type="dxa" w:w="9360"/>
+        <w:jc w:val="left"/>
+        <w:tblLayout w:type="fixed"/>
+        <w:tblLook w:firstColumn="1" w:firstRow="1" w:lastColumn="0" w:lastRow="0" w:noHBand="0" w:noVBand="1" w:val="04A0"/>
+        <w:tblInd w:w="120" w:type="dxa"/>
+        <w:tblBorders>
+          <w:top w:val="single" w:sz="4" w:color="B7C9E2"/>
+          <w:left w:val="single" w:sz="4" w:color="B7C9E2"/>
+          <w:bottom w:val="single" w:sz="4" w:color="B7C9E2"/>
+          <w:right w:val="single" w:sz="4" w:color="B7C9E2"/>
+          <w:insideH w:val="single" w:sz="4" w:color="B7C9E2"/>
+          <w:insideV w:val="single" w:sz="4" w:color="B7C9E2"/>
+        </w:tblBorders>
+      </w:tblPr>
+      <w:tblGrid>
+        <w:gridCol w:w="2000"/>
+        <w:gridCol w:w="4200"/>
+        <w:gridCol w:w="3160"/>
+      </w:tblGrid>
+      <w:tr>
+        <w:trPr>
+          <w:tblHeader w:val="true"/>
+          <w:cantSplit w:val="true"/>
+        </w:trPr>
+        <w:tc>
+          <w:tcPr>
+            <w:tcW w:type="dxa" w:w="2000"/>
+            <w:shd w:fill="E8EEF5"/>
+            <w:tcMar>
+              <w:top w:w="80" w:type="dxa"/>
+              <w:start w:w="120" w:type="dxa"/>
+              <w:bottom w:w="80" w:type="dxa"/>
+              <w:end w:w="120" w:type="dxa"/>
+            </w:tcMar>
+            <w:vAlign w:val="center"/>
+          </w:tcPr>
+          <w:p>
+            <w:pPr>
+              <w:spacing w:after="0"/>
+            </w:pPr>
+            <w:r>
+              <w:rPr>
+                <w:rFonts w:ascii="Microsoft YaHei" w:hAnsi="Microsoft YaHei" w:eastAsia="Microsoft YaHei"/>
+                <w:b/>
+                <w:color w:val="17365D"/>
+                <w:sz w:val="16"/>
+              </w:rPr>
+              <w:t>内部任务</w:t>
+            </w:r>
+          </w:p>
+        </w:tc>
+        <w:tc>
+          <w:tcPr>
+            <w:tcW w:type="dxa" w:w="4200"/>
+            <w:shd w:fill="E8EEF5"/>
+            <w:tcMar>
+              <w:top w:w="80" w:type="dxa"/>
+              <w:start w:w="120" w:type="dxa"/>
+              <w:bottom w:w="80" w:type="dxa"/>
+              <w:end w:w="120" w:type="dxa"/>
+            </w:tcMar>
+            <w:vAlign w:val="center"/>
+          </w:tcPr>
+          <w:p>
+            <w:pPr>
+              <w:spacing w:after="0"/>
+            </w:pPr>
+            <w:r>
+              <w:rPr>
+                <w:rFonts w:ascii="Microsoft YaHei" w:hAnsi="Microsoft YaHei" w:eastAsia="Microsoft YaHei"/>
+                <w:b/>
+                <w:color w:val="17365D"/>
+                <w:sz w:val="16"/>
+              </w:rPr>
+              <w:t>实施内容</w:t>
+            </w:r>
+          </w:p>
+        </w:tc>
+        <w:tc>
+          <w:tcPr>
+            <w:tcW w:type="dxa" w:w="3160"/>
+            <w:shd w:fill="E8EEF5"/>
+            <w:tcMar>
+              <w:top w:w="80" w:type="dxa"/>
+              <w:start w:w="120" w:type="dxa"/>
+              <w:bottom w:w="80" w:type="dxa"/>
+              <w:end w:w="120" w:type="dxa"/>
+            </w:tcMar>
+            <w:vAlign w:val="center"/>
+          </w:tcPr>
+          <w:p>
+            <w:pPr>
+              <w:spacing w:after="0"/>
+            </w:pPr>
+            <w:r>
+              <w:rPr>
+                <w:rFonts w:ascii="Microsoft YaHei" w:hAnsi="Microsoft YaHei" w:eastAsia="Microsoft YaHei"/>
+                <w:b/>
+                <w:color w:val="17365D"/>
+                <w:sz w:val="16"/>
+              </w:rPr>
+              <w:t>验收重点</w:t>
+            </w:r>
+          </w:p>
+        </w:tc>
+      </w:tr>
+      <w:tr>
+        <w:trPr>
+          <w:cantSplit w:val="true"/>
+        </w:trPr>
+        <w:tc>
+          <w:tcPr>
+            <w:tcW w:type="dxa" w:w="2000"/>
+            <w:tcMar>
+              <w:top w:w="80" w:type="dxa"/>
+              <w:start w:w="120" w:type="dxa"/>
+              <w:bottom w:w="80" w:type="dxa"/>
+              <w:end w:w="120" w:type="dxa"/>
+            </w:tcMar>
+            <w:vAlign w:val="center"/>
+          </w:tcPr>
+          <w:p>
+            <w:pPr>
+              <w:spacing w:after="0" w:line="252" w:lineRule="auto"/>
+            </w:pPr>
+            <w:r>
+              <w:rPr>
+                <w:rFonts w:ascii="Microsoft YaHei" w:hAnsi="Microsoft YaHei" w:eastAsia="Microsoft YaHei"/>
+                <w:color w:val="1F1F1F"/>
+                <w:sz w:val="16"/>
+              </w:rPr>
+              <w:t>运行身份与状态契约</w:t>
+            </w:r>
+          </w:p>
+        </w:tc>
+        <w:tc>
+          <w:tcPr>
+            <w:tcW w:type="dxa" w:w="4200"/>
+            <w:tcMar>
+              <w:top w:w="80" w:type="dxa"/>
+              <w:start w:w="120" w:type="dxa"/>
+              <w:bottom w:w="80" w:type="dxa"/>
+              <w:end w:w="120" w:type="dxa"/>
+            </w:tcMar>
+            <w:vAlign w:val="center"/>
+          </w:tcPr>
+          <w:p>
+            <w:pPr>
+              <w:spacing w:after="0" w:line="252" w:lineRule="auto"/>
+            </w:pPr>
+            <w:r>
+              <w:rPr>
+                <w:rFonts w:ascii="Microsoft YaHei" w:hAnsi="Microsoft YaHei" w:eastAsia="Microsoft YaHei"/>
+                <w:color w:val="1F1F1F"/>
+                <w:sz w:val="16"/>
+              </w:rPr>
+              <w:t>普通训练与自动调优共用版本化运行身份、状态Schema和原子写入；兼容读取旧状态</w:t>
+            </w:r>
+          </w:p>
+        </w:tc>
+        <w:tc>
+          <w:tcPr>
+            <w:tcW w:type="dxa" w:w="3160"/>
+            <w:tcMar>
+              <w:top w:w="80" w:type="dxa"/>
+              <w:start w:w="120" w:type="dxa"/>
+              <w:bottom w:w="80" w:type="dxa"/>
+              <w:end w:w="120" w:type="dxa"/>
+            </w:tcMar>
+            <w:vAlign w:val="center"/>
+          </w:tcPr>
+          <w:p>
+            <w:pPr>
+              <w:spacing w:after="0" w:line="252" w:lineRule="auto"/>
+            </w:pPr>
+            <w:r>
+              <w:rPr>
+                <w:rFonts w:ascii="Microsoft YaHei" w:hAnsi="Microsoft YaHei" w:eastAsia="Microsoft YaHei"/>
+                <w:color w:val="1F1F1F"/>
+                <w:sz w:val="16"/>
+              </w:rPr>
+              <w:t>run_id/session_id唯一；旧状态可读；半写文件不覆盖有效状态</w:t>
+            </w:r>
+          </w:p>
+        </w:tc>
+      </w:tr>
+      <w:tr>
+        <w:trPr>
+          <w:cantSplit w:val="true"/>
+        </w:trPr>
+        <w:tc>
+          <w:tcPr>
+            <w:tcW w:type="dxa" w:w="2000"/>
+            <w:tcMar>
+              <w:top w:w="80" w:type="dxa"/>
+              <w:start w:w="120" w:type="dxa"/>
+              <w:bottom w:w="80" w:type="dxa"/>
+              <w:end w:w="120" w:type="dxa"/>
+            </w:tcMar>
+            <w:vAlign w:val="center"/>
+            <w:shd w:fill="F8FAFC"/>
+          </w:tcPr>
+          <w:p>
+            <w:pPr>
+              <w:spacing w:after="0" w:line="252" w:lineRule="auto"/>
+            </w:pPr>
+            <w:r>
+              <w:rPr>
+                <w:rFonts w:ascii="Microsoft YaHei" w:hAnsi="Microsoft YaHei" w:eastAsia="Microsoft YaHei"/>
+                <w:color w:val="1F1F1F"/>
+                <w:sz w:val="16"/>
+              </w:rPr>
+              <w:t>进程与事件事实</w:t>
+            </w:r>
+          </w:p>
+        </w:tc>
+        <w:tc>
+          <w:tcPr>
+            <w:tcW w:type="dxa" w:w="4200"/>
+            <w:tcMar>
+              <w:top w:w="80" w:type="dxa"/>
+              <w:start w:w="120" w:type="dxa"/>
+              <w:bottom w:w="80" w:type="dxa"/>
+              <w:end w:w="120" w:type="dxa"/>
+            </w:tcMar>
+            <w:vAlign w:val="center"/>
+            <w:shd w:fill="F8FAFC"/>
+          </w:tcPr>
+          <w:p>
+            <w:pPr>
+              <w:spacing w:after="0" w:line="252" w:lineRule="auto"/>
+            </w:pPr>
+            <w:r>
+              <w:rPr>
+                <w:rFonts w:ascii="Microsoft YaHei" w:hAnsi="Microsoft YaHei" w:eastAsia="Microsoft YaHei"/>
+                <w:color w:val="1F1F1F"/>
+                <w:sz w:val="16"/>
+              </w:rPr>
+              <w:t>记录PID及进程身份、启动时间、阶段、最后事件序号/时间和终态；服务启动与查询时复核</w:t>
+            </w:r>
+          </w:p>
+        </w:tc>
+        <w:tc>
+          <w:tcPr>
+            <w:tcW w:type="dxa" w:w="3160"/>
+            <w:tcMar>
+              <w:top w:w="80" w:type="dxa"/>
+              <w:start w:w="120" w:type="dxa"/>
+              <w:bottom w:w="80" w:type="dxa"/>
+              <w:end w:w="120" w:type="dxa"/>
+            </w:tcMar>
+            <w:vAlign w:val="center"/>
+            <w:shd w:fill="F8FAFC"/>
+          </w:tcPr>
+          <w:p>
+            <w:pPr>
+              <w:spacing w:after="0" w:line="252" w:lineRule="auto"/>
+            </w:pPr>
+            <w:r>
+              <w:rPr>
+                <w:rFonts w:ascii="Microsoft YaHei" w:hAnsi="Microsoft YaHei" w:eastAsia="Microsoft YaHei"/>
+                <w:color w:val="1F1F1F"/>
+                <w:sz w:val="16"/>
+              </w:rPr>
+              <w:t>PID复用不误判；进程异常消失标记interrupted或unknown</w:t>
+            </w:r>
+          </w:p>
+        </w:tc>
+      </w:tr>
+      <w:tr>
+        <w:trPr>
+          <w:cantSplit w:val="true"/>
+        </w:trPr>
+        <w:tc>
+          <w:tcPr>
+            <w:tcW w:type="dxa" w:w="2000"/>
+            <w:tcMar>
+              <w:top w:w="80" w:type="dxa"/>
+              <w:start w:w="120" w:type="dxa"/>
+              <w:bottom w:w="80" w:type="dxa"/>
+              <w:end w:w="120" w:type="dxa"/>
+            </w:tcMar>
+            <w:vAlign w:val="center"/>
+          </w:tcPr>
+          <w:p>
+            <w:pPr>
+              <w:spacing w:after="0" w:line="252" w:lineRule="auto"/>
+            </w:pPr>
+            <w:r>
+              <w:rPr>
+                <w:rFonts w:ascii="Microsoft YaHei" w:hAnsi="Microsoft YaHei" w:eastAsia="Microsoft YaHei"/>
+                <w:color w:val="1F1F1F"/>
+                <w:sz w:val="16"/>
+              </w:rPr>
+              <w:t>刷新与重连</w:t>
+            </w:r>
+          </w:p>
+        </w:tc>
+        <w:tc>
+          <w:tcPr>
+            <w:tcW w:type="dxa" w:w="4200"/>
+            <w:tcMar>
+              <w:top w:w="80" w:type="dxa"/>
+              <w:start w:w="120" w:type="dxa"/>
+              <w:bottom w:w="80" w:type="dxa"/>
+              <w:end w:w="120" w:type="dxa"/>
+            </w:tcMar>
+            <w:vAlign w:val="center"/>
+          </w:tcPr>
+          <w:p>
+            <w:pPr>
+              <w:spacing w:after="0" w:line="252" w:lineRule="auto"/>
+            </w:pPr>
+            <w:r>
+              <w:rPr>
+                <w:rFonts w:ascii="Microsoft YaHei" w:hAnsi="Microsoft YaHei" w:eastAsia="Microsoft YaHei"/>
+                <w:color w:val="1F1F1F"/>
+                <w:sz w:val="16"/>
+              </w:rPr>
+              <w:t>API返回统一状态；SSE按最后事件位置续读可用日志/事件；UI刷新后展示运行、完成、失败、中断或未知</w:t>
+            </w:r>
+          </w:p>
+        </w:tc>
+        <w:tc>
+          <w:tcPr>
+            <w:tcW w:type="dxa" w:w="3160"/>
+            <w:tcMar>
+              <w:top w:w="80" w:type="dxa"/>
+              <w:start w:w="120" w:type="dxa"/>
+              <w:bottom w:w="80" w:type="dxa"/>
+              <w:end w:w="120" w:type="dxa"/>
+            </w:tcMar>
+            <w:vAlign w:val="center"/>
+          </w:tcPr>
+          <w:p>
+            <w:pPr>
+              <w:spacing w:after="0" w:line="252" w:lineRule="auto"/>
+            </w:pPr>
+            <w:r>
+              <w:rPr>
+                <w:rFonts w:ascii="Microsoft YaHei" w:hAnsi="Microsoft YaHei" w:eastAsia="Microsoft YaHei"/>
+                <w:color w:val="1F1F1F"/>
+                <w:sz w:val="16"/>
+              </w:rPr>
+              <w:t>按钮与状态一致；不把状态展示描述成重新接管进程或断点续训</w:t>
+            </w:r>
+          </w:p>
+        </w:tc>
+      </w:tr>
+    </w:tbl>
+    <w:p>
+      <w:pPr>
+        <w:spacing w:before="0" w:after="20" w:line="20" w:lineRule="exact"/>
+      </w:pPr>
+      <w:r>
+        <w:rPr>
+          <w:sz w:val="2"/>
+        </w:rPr>
+        <w:t xml:space="preserve"> </w:t>
+      </w:r>
+    </w:p>
+    <w:tbl>
+      <w:tblPr>
+        <w:tblW w:type="dxa" w:w="9360"/>
+        <w:jc w:val="left"/>
+        <w:tblLayout w:type="fixed"/>
+        <w:tblLook w:firstColumn="1" w:firstRow="1" w:lastColumn="0" w:lastRow="0" w:noHBand="0" w:noVBand="1" w:val="04A0"/>
+        <w:tblInd w:w="120" w:type="dxa"/>
+        <w:tblBorders>
+          <w:top w:val="single" w:sz="1" w:color="FFF2CC"/>
+          <w:left w:val="single" w:sz="1" w:color="FFF2CC"/>
+          <w:bottom w:val="single" w:sz="1" w:color="FFF2CC"/>
+          <w:right w:val="single" w:sz="1" w:color="FFF2CC"/>
+          <w:insideH w:val="single" w:sz="1" w:color="FFF2CC"/>
+          <w:insideV w:val="single" w:sz="1" w:color="FFF2CC"/>
+        </w:tblBorders>
+      </w:tblPr>
+      <w:tblGrid>
+        <w:gridCol w:w="9360"/>
+      </w:tblGrid>
+      <w:tr>
+        <w:tc>
+          <w:tcPr>
+            <w:tcW w:type="dxa" w:w="9360"/>
+            <w:shd w:fill="FFF2CC"/>
+            <w:tcMar>
+              <w:top w:w="140" w:type="dxa"/>
+              <w:start w:w="180" w:type="dxa"/>
+              <w:bottom w:w="140" w:type="dxa"/>
+              <w:end w:w="180" w:type="dxa"/>
+            </w:tcMar>
+          </w:tcPr>
+          <w:p>
+            <w:pPr>
+              <w:spacing w:after="0"/>
+            </w:pPr>
+            <w:r>
+              <w:rPr>
+                <w:rFonts w:ascii="Microsoft YaHei" w:hAnsi="Microsoft YaHei" w:eastAsia="Microsoft YaHei"/>
+                <w:b/>
+                <w:color w:val="17365D"/>
+                <w:sz w:val="21"/>
+              </w:rPr>
+              <w:t>交付边界：</w:t>
+            </w:r>
+            <w:r>
+              <w:rPr>
+                <w:rFonts w:ascii="Microsoft YaHei" w:hAnsi="Microsoft YaHei" w:eastAsia="Microsoft YaHei"/>
+                <w:color w:val="1F1F1F"/>
+                <w:sz w:val="21"/>
+              </w:rPr>
+              <w:t>S1.5三项内容存在强依赖，作为一个批次统一设计、开发、验收和提交。它只保证状态事实与页面重连可靠，不实现训练进程重新接管、断点续训或服务重启后自动继续训练。</w:t>
+            </w:r>
+          </w:p>
+        </w:tc>
+      </w:tr>
+    </w:tbl>
+    <w:p>
+      <w:pPr>
+        <w:spacing w:after="20"/>
+      </w:pPr>
     </w:p>
     <w:p>
       <w:pPr>
@@ -2518,60 +2951,710 @@
         <w:t>SQLite只作为Studio本地单用户索引库，不承担登录、角色、JWT或多租户。A0审计继续保留为可移植JSON事实文件。</w:t>
       </w:r>
     </w:p>
+    <w:tbl>
+      <w:tblPr>
+        <w:tblW w:type="dxa" w:w="9360"/>
+        <w:jc w:val="left"/>
+        <w:tblLayout w:type="fixed"/>
+        <w:tblLook w:firstColumn="1" w:firstRow="1" w:lastColumn="0" w:lastRow="0" w:noHBand="0" w:noVBand="1" w:val="04A0"/>
+        <w:tblInd w:w="120" w:type="dxa"/>
+        <w:tblBorders>
+          <w:top w:val="single" w:sz="4" w:color="B7C9E2"/>
+          <w:left w:val="single" w:sz="4" w:color="B7C9E2"/>
+          <w:bottom w:val="single" w:sz="4" w:color="B7C9E2"/>
+          <w:right w:val="single" w:sz="4" w:color="B7C9E2"/>
+          <w:insideH w:val="single" w:sz="4" w:color="B7C9E2"/>
+          <w:insideV w:val="single" w:sz="4" w:color="B7C9E2"/>
+        </w:tblBorders>
+      </w:tblPr>
+      <w:tblGrid>
+        <w:gridCol w:w="800"/>
+        <w:gridCol w:w="1000"/>
+        <w:gridCol w:w="3500"/>
+        <w:gridCol w:w="3100"/>
+        <w:gridCol w:w="960"/>
+      </w:tblGrid>
+      <w:tr>
+        <w:trPr>
+          <w:tblHeader w:val="true"/>
+          <w:cantSplit w:val="true"/>
+        </w:trPr>
+        <w:tc>
+          <w:tcPr>
+            <w:tcW w:type="dxa" w:w="800"/>
+            <w:shd w:fill="E8EEF5"/>
+            <w:tcMar>
+              <w:top w:w="80" w:type="dxa"/>
+              <w:start w:w="120" w:type="dxa"/>
+              <w:bottom w:w="80" w:type="dxa"/>
+              <w:end w:w="120" w:type="dxa"/>
+            </w:tcMar>
+            <w:vAlign w:val="center"/>
+          </w:tcPr>
+          <w:p>
+            <w:pPr>
+              <w:spacing w:after="0"/>
+            </w:pPr>
+            <w:r>
+              <w:rPr>
+                <w:rFonts w:ascii="Microsoft YaHei" w:hAnsi="Microsoft YaHei" w:eastAsia="Microsoft YaHei"/>
+                <w:b/>
+                <w:color w:val="17365D"/>
+                <w:sz w:val="16"/>
+              </w:rPr>
+              <w:t>批次</w:t>
+            </w:r>
+          </w:p>
+        </w:tc>
+        <w:tc>
+          <w:tcPr>
+            <w:tcW w:type="dxa" w:w="1000"/>
+            <w:shd w:fill="E8EEF5"/>
+            <w:tcMar>
+              <w:top w:w="80" w:type="dxa"/>
+              <w:start w:w="120" w:type="dxa"/>
+              <w:bottom w:w="80" w:type="dxa"/>
+              <w:end w:w="120" w:type="dxa"/>
+            </w:tcMar>
+            <w:vAlign w:val="center"/>
+          </w:tcPr>
+          <w:p>
+            <w:pPr>
+              <w:spacing w:after="0"/>
+            </w:pPr>
+            <w:r>
+              <w:rPr>
+                <w:rFonts w:ascii="Microsoft YaHei" w:hAnsi="Microsoft YaHei" w:eastAsia="Microsoft YaHei"/>
+                <w:b/>
+                <w:color w:val="17365D"/>
+                <w:sz w:val="16"/>
+              </w:rPr>
+              <w:t>状态</w:t>
+            </w:r>
+          </w:p>
+        </w:tc>
+        <w:tc>
+          <w:tcPr>
+            <w:tcW w:type="dxa" w:w="3500"/>
+            <w:shd w:fill="E8EEF5"/>
+            <w:tcMar>
+              <w:top w:w="80" w:type="dxa"/>
+              <w:start w:w="120" w:type="dxa"/>
+              <w:bottom w:w="80" w:type="dxa"/>
+              <w:end w:w="120" w:type="dxa"/>
+            </w:tcMar>
+            <w:vAlign w:val="center"/>
+          </w:tcPr>
+          <w:p>
+            <w:pPr>
+              <w:spacing w:after="0"/>
+            </w:pPr>
+            <w:r>
+              <w:rPr>
+                <w:rFonts w:ascii="Microsoft YaHei" w:hAnsi="Microsoft YaHei" w:eastAsia="Microsoft YaHei"/>
+                <w:b/>
+                <w:color w:val="17365D"/>
+                <w:sz w:val="16"/>
+              </w:rPr>
+              <w:t>要做事项</w:t>
+            </w:r>
+          </w:p>
+        </w:tc>
+        <w:tc>
+          <w:tcPr>
+            <w:tcW w:type="dxa" w:w="3100"/>
+            <w:shd w:fill="E8EEF5"/>
+            <w:tcMar>
+              <w:top w:w="80" w:type="dxa"/>
+              <w:start w:w="120" w:type="dxa"/>
+              <w:bottom w:w="80" w:type="dxa"/>
+              <w:end w:w="120" w:type="dxa"/>
+            </w:tcMar>
+            <w:vAlign w:val="center"/>
+          </w:tcPr>
+          <w:p>
+            <w:pPr>
+              <w:spacing w:after="0"/>
+            </w:pPr>
+            <w:r>
+              <w:rPr>
+                <w:rFonts w:ascii="Microsoft YaHei" w:hAnsi="Microsoft YaHei" w:eastAsia="Microsoft YaHei"/>
+                <w:b/>
+                <w:color w:val="17365D"/>
+                <w:sz w:val="16"/>
+              </w:rPr>
+              <w:t>验收重点</w:t>
+            </w:r>
+          </w:p>
+        </w:tc>
+        <w:tc>
+          <w:tcPr>
+            <w:tcW w:type="dxa" w:w="960"/>
+            <w:shd w:fill="E8EEF5"/>
+            <w:tcMar>
+              <w:top w:w="80" w:type="dxa"/>
+              <w:start w:w="120" w:type="dxa"/>
+              <w:bottom w:w="80" w:type="dxa"/>
+              <w:end w:w="120" w:type="dxa"/>
+            </w:tcMar>
+            <w:vAlign w:val="center"/>
+          </w:tcPr>
+          <w:p>
+            <w:pPr>
+              <w:spacing w:after="0"/>
+            </w:pPr>
+            <w:r>
+              <w:rPr>
+                <w:rFonts w:ascii="Microsoft YaHei" w:hAnsi="Microsoft YaHei" w:eastAsia="Microsoft YaHei"/>
+                <w:b/>
+                <w:color w:val="17365D"/>
+                <w:sz w:val="16"/>
+              </w:rPr>
+              <w:t>人日</w:t>
+            </w:r>
+          </w:p>
+        </w:tc>
+      </w:tr>
+      <w:tr>
+        <w:trPr>
+          <w:cantSplit w:val="true"/>
+        </w:trPr>
+        <w:tc>
+          <w:tcPr>
+            <w:tcW w:type="dxa" w:w="800"/>
+            <w:tcMar>
+              <w:top w:w="80" w:type="dxa"/>
+              <w:start w:w="120" w:type="dxa"/>
+              <w:bottom w:w="80" w:type="dxa"/>
+              <w:end w:w="120" w:type="dxa"/>
+            </w:tcMar>
+            <w:vAlign w:val="center"/>
+          </w:tcPr>
+          <w:p>
+            <w:pPr>
+              <w:spacing w:after="0" w:line="252" w:lineRule="auto"/>
+            </w:pPr>
+            <w:r>
+              <w:rPr>
+                <w:rFonts w:ascii="Microsoft YaHei" w:hAnsi="Microsoft YaHei" w:eastAsia="Microsoft YaHei"/>
+                <w:color w:val="1F1F1F"/>
+                <w:sz w:val="16"/>
+              </w:rPr>
+              <w:t>S2.1</w:t>
+            </w:r>
+          </w:p>
+        </w:tc>
+        <w:tc>
+          <w:tcPr>
+            <w:tcW w:type="dxa" w:w="1000"/>
+            <w:tcMar>
+              <w:top w:w="80" w:type="dxa"/>
+              <w:start w:w="120" w:type="dxa"/>
+              <w:bottom w:w="80" w:type="dxa"/>
+              <w:end w:w="120" w:type="dxa"/>
+            </w:tcMar>
+            <w:vAlign w:val="center"/>
+          </w:tcPr>
+          <w:p>
+            <w:pPr>
+              <w:spacing w:after="0" w:line="252" w:lineRule="auto"/>
+            </w:pPr>
+            <w:r>
+              <w:rPr>
+                <w:rFonts w:ascii="Microsoft YaHei" w:hAnsi="Microsoft YaHei" w:eastAsia="Microsoft YaHei"/>
+                <w:color w:val="1F1F1F"/>
+                <w:sz w:val="16"/>
+              </w:rPr>
+              <w:t>S1.5后</w:t>
+            </w:r>
+          </w:p>
+        </w:tc>
+        <w:tc>
+          <w:tcPr>
+            <w:tcW w:type="dxa" w:w="3500"/>
+            <w:tcMar>
+              <w:top w:w="80" w:type="dxa"/>
+              <w:start w:w="120" w:type="dxa"/>
+              <w:bottom w:w="80" w:type="dxa"/>
+              <w:end w:w="120" w:type="dxa"/>
+            </w:tcMar>
+            <w:vAlign w:val="center"/>
+          </w:tcPr>
+          <w:p>
+            <w:pPr>
+              <w:spacing w:after="0" w:line="252" w:lineRule="auto"/>
+            </w:pPr>
+            <w:r>
+              <w:rPr>
+                <w:rFonts w:ascii="Microsoft YaHei" w:hAnsi="Microsoft YaHei" w:eastAsia="Microsoft YaHei"/>
+                <w:color w:val="1F1F1F"/>
+                <w:sz w:val="16"/>
+              </w:rPr>
+              <w:t>SQLite连接、版本化Schema、事务、备份/回滚和迁移框架</w:t>
+            </w:r>
+          </w:p>
+        </w:tc>
+        <w:tc>
+          <w:tcPr>
+            <w:tcW w:type="dxa" w:w="3100"/>
+            <w:tcMar>
+              <w:top w:w="80" w:type="dxa"/>
+              <w:start w:w="120" w:type="dxa"/>
+              <w:bottom w:w="80" w:type="dxa"/>
+              <w:end w:w="120" w:type="dxa"/>
+            </w:tcMar>
+            <w:vAlign w:val="center"/>
+          </w:tcPr>
+          <w:p>
+            <w:pPr>
+              <w:spacing w:after="0" w:line="252" w:lineRule="auto"/>
+            </w:pPr>
+            <w:r>
+              <w:rPr>
+                <w:rFonts w:ascii="Microsoft YaHei" w:hAnsi="Microsoft YaHei" w:eastAsia="Microsoft YaHei"/>
+                <w:color w:val="1F1F1F"/>
+                <w:sz w:val="16"/>
+              </w:rPr>
+              <w:t>建库/迁移失败可回滚；JSON事实文件不被覆盖</w:t>
+            </w:r>
+          </w:p>
+        </w:tc>
+        <w:tc>
+          <w:tcPr>
+            <w:tcW w:type="dxa" w:w="960"/>
+            <w:tcMar>
+              <w:top w:w="80" w:type="dxa"/>
+              <w:start w:w="120" w:type="dxa"/>
+              <w:bottom w:w="80" w:type="dxa"/>
+              <w:end w:w="120" w:type="dxa"/>
+            </w:tcMar>
+            <w:vAlign w:val="center"/>
+          </w:tcPr>
+          <w:p>
+            <w:pPr>
+              <w:spacing w:after="0" w:line="252" w:lineRule="auto"/>
+            </w:pPr>
+            <w:r>
+              <w:rPr>
+                <w:rFonts w:ascii="Microsoft YaHei" w:hAnsi="Microsoft YaHei" w:eastAsia="Microsoft YaHei"/>
+                <w:color w:val="1F1F1F"/>
+                <w:sz w:val="16"/>
+              </w:rPr>
+              <w:t>2–3</w:t>
+            </w:r>
+          </w:p>
+        </w:tc>
+      </w:tr>
+      <w:tr>
+        <w:trPr>
+          <w:cantSplit w:val="true"/>
+        </w:trPr>
+        <w:tc>
+          <w:tcPr>
+            <w:tcW w:type="dxa" w:w="800"/>
+            <w:tcMar>
+              <w:top w:w="80" w:type="dxa"/>
+              <w:start w:w="120" w:type="dxa"/>
+              <w:bottom w:w="80" w:type="dxa"/>
+              <w:end w:w="120" w:type="dxa"/>
+            </w:tcMar>
+            <w:vAlign w:val="center"/>
+            <w:shd w:fill="F8FAFC"/>
+          </w:tcPr>
+          <w:p>
+            <w:pPr>
+              <w:spacing w:after="0" w:line="252" w:lineRule="auto"/>
+            </w:pPr>
+            <w:r>
+              <w:rPr>
+                <w:rFonts w:ascii="Microsoft YaHei" w:hAnsi="Microsoft YaHei" w:eastAsia="Microsoft YaHei"/>
+                <w:color w:val="1F1F1F"/>
+                <w:sz w:val="16"/>
+              </w:rPr>
+              <w:t>S2.2</w:t>
+            </w:r>
+          </w:p>
+        </w:tc>
+        <w:tc>
+          <w:tcPr>
+            <w:tcW w:type="dxa" w:w="1000"/>
+            <w:tcMar>
+              <w:top w:w="80" w:type="dxa"/>
+              <w:start w:w="120" w:type="dxa"/>
+              <w:bottom w:w="80" w:type="dxa"/>
+              <w:end w:w="120" w:type="dxa"/>
+            </w:tcMar>
+            <w:vAlign w:val="center"/>
+            <w:shd w:fill="F8FAFC"/>
+          </w:tcPr>
+          <w:p>
+            <w:pPr>
+              <w:spacing w:after="0" w:line="252" w:lineRule="auto"/>
+            </w:pPr>
+            <w:r>
+              <w:rPr>
+                <w:rFonts w:ascii="Microsoft YaHei" w:hAnsi="Microsoft YaHei" w:eastAsia="Microsoft YaHei"/>
+                <w:color w:val="1F1F1F"/>
+                <w:sz w:val="16"/>
+              </w:rPr>
+              <w:t>后续</w:t>
+            </w:r>
+          </w:p>
+        </w:tc>
+        <w:tc>
+          <w:tcPr>
+            <w:tcW w:type="dxa" w:w="3500"/>
+            <w:tcMar>
+              <w:top w:w="80" w:type="dxa"/>
+              <w:start w:w="120" w:type="dxa"/>
+              <w:bottom w:w="80" w:type="dxa"/>
+              <w:end w:w="120" w:type="dxa"/>
+            </w:tcMar>
+            <w:vAlign w:val="center"/>
+            <w:shd w:fill="F8FAFC"/>
+          </w:tcPr>
+          <w:p>
+            <w:pPr>
+              <w:spacing w:after="0" w:line="252" w:lineRule="auto"/>
+            </w:pPr>
+            <w:r>
+              <w:rPr>
+                <w:rFonts w:ascii="Microsoft YaHei" w:hAnsi="Microsoft YaHei" w:eastAsia="Microsoft YaHei"/>
+                <w:color w:val="1F1F1F"/>
+                <w:sz w:val="16"/>
+              </w:rPr>
+              <w:t>数据集名称、目录引用、任务类型、快照身份、校验状态和最近使用时间</w:t>
+            </w:r>
+          </w:p>
+        </w:tc>
+        <w:tc>
+          <w:tcPr>
+            <w:tcW w:type="dxa" w:w="3100"/>
+            <w:tcMar>
+              <w:top w:w="80" w:type="dxa"/>
+              <w:start w:w="120" w:type="dxa"/>
+              <w:bottom w:w="80" w:type="dxa"/>
+              <w:end w:w="120" w:type="dxa"/>
+            </w:tcMar>
+            <w:vAlign w:val="center"/>
+            <w:shd w:fill="F8FAFC"/>
+          </w:tcPr>
+          <w:p>
+            <w:pPr>
+              <w:spacing w:after="0" w:line="252" w:lineRule="auto"/>
+            </w:pPr>
+            <w:r>
+              <w:rPr>
+                <w:rFonts w:ascii="Microsoft YaHei" w:hAnsi="Microsoft YaHei" w:eastAsia="Microsoft YaHei"/>
+                <w:color w:val="1F1F1F"/>
+                <w:sz w:val="16"/>
+              </w:rPr>
+              <w:t>多数据集可索引；目录失效和快照损坏状态准确</w:t>
+            </w:r>
+          </w:p>
+        </w:tc>
+        <w:tc>
+          <w:tcPr>
+            <w:tcW w:type="dxa" w:w="960"/>
+            <w:tcMar>
+              <w:top w:w="80" w:type="dxa"/>
+              <w:start w:w="120" w:type="dxa"/>
+              <w:bottom w:w="80" w:type="dxa"/>
+              <w:end w:w="120" w:type="dxa"/>
+            </w:tcMar>
+            <w:vAlign w:val="center"/>
+            <w:shd w:fill="F8FAFC"/>
+          </w:tcPr>
+          <w:p>
+            <w:pPr>
+              <w:spacing w:after="0" w:line="252" w:lineRule="auto"/>
+            </w:pPr>
+            <w:r>
+              <w:rPr>
+                <w:rFonts w:ascii="Microsoft YaHei" w:hAnsi="Microsoft YaHei" w:eastAsia="Microsoft YaHei"/>
+                <w:color w:val="1F1F1F"/>
+                <w:sz w:val="16"/>
+              </w:rPr>
+              <w:t>2–3</w:t>
+            </w:r>
+          </w:p>
+        </w:tc>
+      </w:tr>
+      <w:tr>
+        <w:trPr>
+          <w:cantSplit w:val="true"/>
+        </w:trPr>
+        <w:tc>
+          <w:tcPr>
+            <w:tcW w:type="dxa" w:w="800"/>
+            <w:tcMar>
+              <w:top w:w="80" w:type="dxa"/>
+              <w:start w:w="120" w:type="dxa"/>
+              <w:bottom w:w="80" w:type="dxa"/>
+              <w:end w:w="120" w:type="dxa"/>
+            </w:tcMar>
+            <w:vAlign w:val="center"/>
+          </w:tcPr>
+          <w:p>
+            <w:pPr>
+              <w:spacing w:after="0" w:line="252" w:lineRule="auto"/>
+            </w:pPr>
+            <w:r>
+              <w:rPr>
+                <w:rFonts w:ascii="Microsoft YaHei" w:hAnsi="Microsoft YaHei" w:eastAsia="Microsoft YaHei"/>
+                <w:color w:val="1F1F1F"/>
+                <w:sz w:val="16"/>
+              </w:rPr>
+              <w:t>S2.3</w:t>
+            </w:r>
+          </w:p>
+        </w:tc>
+        <w:tc>
+          <w:tcPr>
+            <w:tcW w:type="dxa" w:w="1000"/>
+            <w:tcMar>
+              <w:top w:w="80" w:type="dxa"/>
+              <w:start w:w="120" w:type="dxa"/>
+              <w:bottom w:w="80" w:type="dxa"/>
+              <w:end w:w="120" w:type="dxa"/>
+            </w:tcMar>
+            <w:vAlign w:val="center"/>
+          </w:tcPr>
+          <w:p>
+            <w:pPr>
+              <w:spacing w:after="0" w:line="252" w:lineRule="auto"/>
+            </w:pPr>
+            <w:r>
+              <w:rPr>
+                <w:rFonts w:ascii="Microsoft YaHei" w:hAnsi="Microsoft YaHei" w:eastAsia="Microsoft YaHei"/>
+                <w:color w:val="1F1F1F"/>
+                <w:sz w:val="16"/>
+              </w:rPr>
+              <w:t>后续</w:t>
+            </w:r>
+          </w:p>
+        </w:tc>
+        <w:tc>
+          <w:tcPr>
+            <w:tcW w:type="dxa" w:w="3500"/>
+            <w:tcMar>
+              <w:top w:w="80" w:type="dxa"/>
+              <w:start w:w="120" w:type="dxa"/>
+              <w:bottom w:w="80" w:type="dxa"/>
+              <w:end w:w="120" w:type="dxa"/>
+            </w:tcMar>
+            <w:vAlign w:val="center"/>
+          </w:tcPr>
+          <w:p>
+            <w:pPr>
+              <w:spacing w:after="0" w:line="252" w:lineRule="auto"/>
+            </w:pPr>
+            <w:r>
+              <w:rPr>
+                <w:rFonts w:ascii="Microsoft YaHei" w:hAnsi="Microsoft YaHei" w:eastAsia="Microsoft YaHei"/>
+                <w:color w:val="1F1F1F"/>
+                <w:sz w:val="16"/>
+              </w:rPr>
+              <w:t>训练、调优、报告、权重和产物索引；旧experiment_history.json幂等迁移</w:t>
+            </w:r>
+          </w:p>
+        </w:tc>
+        <w:tc>
+          <w:tcPr>
+            <w:tcW w:type="dxa" w:w="3100"/>
+            <w:tcMar>
+              <w:top w:w="80" w:type="dxa"/>
+              <w:start w:w="120" w:type="dxa"/>
+              <w:bottom w:w="80" w:type="dxa"/>
+              <w:end w:w="120" w:type="dxa"/>
+            </w:tcMar>
+            <w:vAlign w:val="center"/>
+          </w:tcPr>
+          <w:p>
+            <w:pPr>
+              <w:spacing w:after="0" w:line="252" w:lineRule="auto"/>
+            </w:pPr>
+            <w:r>
+              <w:rPr>
+                <w:rFonts w:ascii="Microsoft YaHei" w:hAnsi="Microsoft YaHei" w:eastAsia="Microsoft YaHei"/>
+                <w:color w:val="1F1F1F"/>
+                <w:sz w:val="16"/>
+              </w:rPr>
+              <w:t>重复迁移不重复记录；损坏JSON只读保护</w:t>
+            </w:r>
+          </w:p>
+        </w:tc>
+        <w:tc>
+          <w:tcPr>
+            <w:tcW w:type="dxa" w:w="960"/>
+            <w:tcMar>
+              <w:top w:w="80" w:type="dxa"/>
+              <w:start w:w="120" w:type="dxa"/>
+              <w:bottom w:w="80" w:type="dxa"/>
+              <w:end w:w="120" w:type="dxa"/>
+            </w:tcMar>
+            <w:vAlign w:val="center"/>
+          </w:tcPr>
+          <w:p>
+            <w:pPr>
+              <w:spacing w:after="0" w:line="252" w:lineRule="auto"/>
+            </w:pPr>
+            <w:r>
+              <w:rPr>
+                <w:rFonts w:ascii="Microsoft YaHei" w:hAnsi="Microsoft YaHei" w:eastAsia="Microsoft YaHei"/>
+                <w:color w:val="1F1F1F"/>
+                <w:sz w:val="16"/>
+              </w:rPr>
+              <w:t>1–3</w:t>
+            </w:r>
+          </w:p>
+        </w:tc>
+      </w:tr>
+      <w:tr>
+        <w:trPr>
+          <w:cantSplit w:val="true"/>
+        </w:trPr>
+        <w:tc>
+          <w:tcPr>
+            <w:tcW w:type="dxa" w:w="800"/>
+            <w:tcMar>
+              <w:top w:w="80" w:type="dxa"/>
+              <w:start w:w="120" w:type="dxa"/>
+              <w:bottom w:w="80" w:type="dxa"/>
+              <w:end w:w="120" w:type="dxa"/>
+            </w:tcMar>
+            <w:vAlign w:val="center"/>
+            <w:shd w:fill="F8FAFC"/>
+          </w:tcPr>
+          <w:p>
+            <w:pPr>
+              <w:spacing w:after="0" w:line="252" w:lineRule="auto"/>
+            </w:pPr>
+            <w:r>
+              <w:rPr>
+                <w:rFonts w:ascii="Microsoft YaHei" w:hAnsi="Microsoft YaHei" w:eastAsia="Microsoft YaHei"/>
+                <w:color w:val="1F1F1F"/>
+                <w:sz w:val="16"/>
+              </w:rPr>
+              <w:t>S2.4</w:t>
+            </w:r>
+          </w:p>
+        </w:tc>
+        <w:tc>
+          <w:tcPr>
+            <w:tcW w:type="dxa" w:w="1000"/>
+            <w:tcMar>
+              <w:top w:w="80" w:type="dxa"/>
+              <w:start w:w="120" w:type="dxa"/>
+              <w:bottom w:w="80" w:type="dxa"/>
+              <w:end w:w="120" w:type="dxa"/>
+            </w:tcMar>
+            <w:vAlign w:val="center"/>
+            <w:shd w:fill="F8FAFC"/>
+          </w:tcPr>
+          <w:p>
+            <w:pPr>
+              <w:spacing w:after="0" w:line="252" w:lineRule="auto"/>
+            </w:pPr>
+            <w:r>
+              <w:rPr>
+                <w:rFonts w:ascii="Microsoft YaHei" w:hAnsi="Microsoft YaHei" w:eastAsia="Microsoft YaHei"/>
+                <w:color w:val="1F1F1F"/>
+                <w:sz w:val="16"/>
+              </w:rPr>
+              <w:t>后续</w:t>
+            </w:r>
+          </w:p>
+        </w:tc>
+        <w:tc>
+          <w:tcPr>
+            <w:tcW w:type="dxa" w:w="3500"/>
+            <w:tcMar>
+              <w:top w:w="80" w:type="dxa"/>
+              <w:start w:w="120" w:type="dxa"/>
+              <w:bottom w:w="80" w:type="dxa"/>
+              <w:end w:w="120" w:type="dxa"/>
+            </w:tcMar>
+            <w:vAlign w:val="center"/>
+            <w:shd w:fill="F8FAFC"/>
+          </w:tcPr>
+          <w:p>
+            <w:pPr>
+              <w:spacing w:after="0" w:line="252" w:lineRule="auto"/>
+            </w:pPr>
+            <w:r>
+              <w:rPr>
+                <w:rFonts w:ascii="Microsoft YaHei" w:hAnsi="Microsoft YaHei" w:eastAsia="Microsoft YaHei"/>
+                <w:color w:val="1F1F1F"/>
+                <w:sz w:val="16"/>
+              </w:rPr>
+              <w:t>数据集切换、筛选、标签、归档、运行对比和报告导出UI</w:t>
+            </w:r>
+          </w:p>
+        </w:tc>
+        <w:tc>
+          <w:tcPr>
+            <w:tcW w:type="dxa" w:w="3100"/>
+            <w:tcMar>
+              <w:top w:w="80" w:type="dxa"/>
+              <w:start w:w="120" w:type="dxa"/>
+              <w:bottom w:w="80" w:type="dxa"/>
+              <w:end w:w="120" w:type="dxa"/>
+            </w:tcMar>
+            <w:vAlign w:val="center"/>
+            <w:shd w:fill="F8FAFC"/>
+          </w:tcPr>
+          <w:p>
+            <w:pPr>
+              <w:spacing w:after="0" w:line="252" w:lineRule="auto"/>
+            </w:pPr>
+            <w:r>
+              <w:rPr>
+                <w:rFonts w:ascii="Microsoft YaHei" w:hAnsi="Microsoft YaHei" w:eastAsia="Microsoft YaHei"/>
+                <w:color w:val="1F1F1F"/>
+                <w:sz w:val="16"/>
+              </w:rPr>
+              <w:t>零值/缺失值正确；失败路径不损坏索引；Chromium通过</w:t>
+            </w:r>
+          </w:p>
+        </w:tc>
+        <w:tc>
+          <w:tcPr>
+            <w:tcW w:type="dxa" w:w="960"/>
+            <w:tcMar>
+              <w:top w:w="80" w:type="dxa"/>
+              <w:start w:w="120" w:type="dxa"/>
+              <w:bottom w:w="80" w:type="dxa"/>
+              <w:end w:w="120" w:type="dxa"/>
+            </w:tcMar>
+            <w:vAlign w:val="center"/>
+            <w:shd w:fill="F8FAFC"/>
+          </w:tcPr>
+          <w:p>
+            <w:pPr>
+              <w:spacing w:after="0" w:line="252" w:lineRule="auto"/>
+            </w:pPr>
+            <w:r>
+              <w:rPr>
+                <w:rFonts w:ascii="Microsoft YaHei" w:hAnsi="Microsoft YaHei" w:eastAsia="Microsoft YaHei"/>
+                <w:color w:val="1F1F1F"/>
+                <w:sz w:val="16"/>
+              </w:rPr>
+              <w:t>1–3</w:t>
+            </w:r>
+          </w:p>
+        </w:tc>
+      </w:tr>
+    </w:tbl>
     <w:p>
       <w:pPr>
-        <w:pStyle w:val="ListBullet"/>
-        <w:spacing w:after="80" w:line="276" w:lineRule="auto"/>
+        <w:spacing w:before="0" w:after="20" w:line="20" w:lineRule="exact"/>
       </w:pPr>
       <w:r>
         <w:rPr>
-          <w:rFonts w:ascii="Microsoft YaHei" w:hAnsi="Microsoft YaHei" w:eastAsia="Microsoft YaHei"/>
-          <w:color w:val="1F1F1F"/>
-          <w:sz w:val="20"/>
+          <w:sz w:val="2"/>
         </w:rPr>
-        <w:t>数据集索引：名称、目录引用、任务类型、快照身份、校验状态、最近使用时间。</w:t>
-      </w:r>
-    </w:p>
-    <w:p>
-      <w:pPr>
-        <w:pStyle w:val="ListBullet"/>
-        <w:spacing w:after="80" w:line="276" w:lineRule="auto"/>
-      </w:pPr>
-      <w:r>
-        <w:rPr>
-          <w:rFonts w:ascii="Microsoft YaHei" w:hAnsi="Microsoft YaHei" w:eastAsia="Microsoft YaHei"/>
-          <w:color w:val="1F1F1F"/>
-          <w:sz w:val="20"/>
-        </w:rPr>
-        <w:t>实验索引：训练、调优、报告、权重、配置和产物位置。</w:t>
-      </w:r>
-    </w:p>
-    <w:p>
-      <w:pPr>
-        <w:pStyle w:val="ListBullet"/>
-        <w:spacing w:after="80" w:line="276" w:lineRule="auto"/>
-      </w:pPr>
-      <w:r>
-        <w:rPr>
-          <w:rFonts w:ascii="Microsoft YaHei" w:hAnsi="Microsoft YaHei" w:eastAsia="Microsoft YaHei"/>
-          <w:color w:val="1F1F1F"/>
-          <w:sz w:val="20"/>
-        </w:rPr>
-        <w:t>历史能力：筛选、标签、归档、运行对比和报告导出。</w:t>
-      </w:r>
-    </w:p>
-    <w:p>
-      <w:pPr>
-        <w:pStyle w:val="ListBullet"/>
-        <w:spacing w:after="80" w:line="276" w:lineRule="auto"/>
-      </w:pPr>
-      <w:r>
-        <w:rPr>
-          <w:rFonts w:ascii="Microsoft YaHei" w:hAnsi="Microsoft YaHei" w:eastAsia="Microsoft YaHei"/>
-          <w:color w:val="1F1F1F"/>
-          <w:sz w:val="20"/>
-        </w:rPr>
-        <w:t>迁移要求：旧experiment_history.json幂等迁移；损坏JSON只读保护；迁移失败不覆盖事实文件。</w:t>
+        <w:t xml:space="preserve"> </w:t>
       </w:r>
     </w:p>
     <w:tbl>
@@ -9983,7 +11066,7 @@
                 <w:color w:val="1F1F1F"/>
                 <w:sz w:val="16"/>
               </w:rPr>
-              <w:t>Studio S2 SQLite</w:t>
+              <w:t>Studio S1.5 状态与重连</w:t>
             </w:r>
           </w:p>
         </w:tc>
@@ -10008,7 +11091,7 @@
                 <w:color w:val="1F1F1F"/>
                 <w:sz w:val="16"/>
               </w:rPr>
-              <w:t>多数据集与实验索引</w:t>
+              <w:t>统一运行身份、PID/阶段/最后事件持久化及API/SSE/UI重连</w:t>
             </w:r>
           </w:p>
         </w:tc>
@@ -10033,7 +11116,7 @@
                 <w:color w:val="1F1F1F"/>
                 <w:sz w:val="16"/>
               </w:rPr>
-              <w:t>旧JSON迁移与损坏保护通过</w:t>
+              <w:t>统一批次验收；不误判PID，不伪造恢复</w:t>
             </w:r>
           </w:p>
         </w:tc>
@@ -10090,7 +11173,7 @@
                 <w:color w:val="1F1F1F"/>
                 <w:sz w:val="16"/>
               </w:rPr>
-              <w:t>Studio S2.5 三任务闭环</w:t>
+              <w:t>Studio S2 SQLite</w:t>
             </w:r>
           </w:p>
         </w:tc>
@@ -10116,7 +11199,7 @@
                 <w:color w:val="1F1F1F"/>
                 <w:sz w:val="16"/>
               </w:rPr>
-              <w:t>YOLOv8 Detect、YOLOv8 Classify、YOLOv5 Detect产品化验收</w:t>
+              <w:t>S2.1–S2.4：存储基础、数据集索引、实验迁移、UI对比归档</w:t>
             </w:r>
           </w:p>
         </w:tc>
@@ -10142,7 +11225,7 @@
                 <w:color w:val="1F1F1F"/>
                 <w:sz w:val="16"/>
               </w:rPr>
-              <w:t>三项短训练、指标、历史、报告、失败路径和UI全部通过</w:t>
+              <w:t>旧JSON迁移、损坏保护和多数据集索引通过</w:t>
             </w:r>
           </w:p>
         </w:tc>
@@ -10197,7 +11280,7 @@
                 <w:color w:val="1F1F1F"/>
                 <w:sz w:val="16"/>
               </w:rPr>
-              <w:t>Studio S3 安装/Linux</w:t>
+              <w:t>Studio S2.5 三任务闭环</w:t>
             </w:r>
           </w:p>
         </w:tc>
@@ -10222,7 +11305,7 @@
                 <w:color w:val="1F1F1F"/>
                 <w:sz w:val="16"/>
               </w:rPr>
-              <w:t>Ubuntu Server兼容、Docker Compose首选交付、原生安装/systemd兼容</w:t>
+              <w:t>YOLOv8 Detect、YOLOv8 Classify、YOLOv5 Detect产品化验收</w:t>
             </w:r>
           </w:p>
         </w:tc>
@@ -10247,7 +11330,7 @@
                 <w:color w:val="1F1F1F"/>
                 <w:sz w:val="16"/>
               </w:rPr>
-              <w:t>非开发人员完成Docker部署；原生安装完成短训练</w:t>
+              <w:t>三项短训练、指标、历史、报告、失败路径和UI全部通过</w:t>
             </w:r>
           </w:p>
         </w:tc>
@@ -10304,7 +11387,7 @@
                 <w:color w:val="1F1F1F"/>
                 <w:sz w:val="16"/>
               </w:rPr>
-              <w:t>Research立项评审</w:t>
+              <w:t>Studio S3 安装/Linux</w:t>
             </w:r>
           </w:p>
         </w:tc>
@@ -10330,7 +11413,7 @@
                 <w:color w:val="1F1F1F"/>
                 <w:sz w:val="16"/>
               </w:rPr>
-              <w:t>确认R0/R1规格、模块清单、数据、GPU和验收预算</w:t>
+              <w:t>Ubuntu Server兼容、Docker Compose首选交付、原生安装/systemd兼容</w:t>
             </w:r>
           </w:p>
         </w:tc>
@@ -10356,7 +11439,7 @@
                 <w:color w:val="1F1F1F"/>
                 <w:sz w:val="16"/>
               </w:rPr>
-              <w:t>艾卡批准独立规格与重新估算</w:t>
+              <w:t>非开发人员完成Docker部署；原生安装完成短训练</w:t>
             </w:r>
           </w:p>
         </w:tc>
@@ -10411,7 +11494,7 @@
                 <w:color w:val="1F1F1F"/>
                 <w:sz w:val="16"/>
               </w:rPr>
-              <w:t>Research后续批次</w:t>
+              <w:t>Research立项评审</w:t>
             </w:r>
           </w:p>
         </w:tc>
@@ -10436,6 +11519,114 @@
                 <w:color w:val="1F1F1F"/>
                 <w:sz w:val="16"/>
               </w:rPr>
+              <w:t>确认R0/R1规格、模块清单、数据、GPU和验收预算</w:t>
+            </w:r>
+          </w:p>
+        </w:tc>
+        <w:tc>
+          <w:tcPr>
+            <w:tcW w:type="dxa" w:w="2940"/>
+            <w:tcMar>
+              <w:top w:w="80" w:type="dxa"/>
+              <w:start w:w="120" w:type="dxa"/>
+              <w:bottom w:w="80" w:type="dxa"/>
+              <w:end w:w="120" w:type="dxa"/>
+            </w:tcMar>
+            <w:vAlign w:val="center"/>
+          </w:tcPr>
+          <w:p>
+            <w:pPr>
+              <w:spacing w:after="0" w:line="252" w:lineRule="auto"/>
+            </w:pPr>
+            <w:r>
+              <w:rPr>
+                <w:rFonts w:ascii="Microsoft YaHei" w:hAnsi="Microsoft YaHei" w:eastAsia="Microsoft YaHei"/>
+                <w:color w:val="1F1F1F"/>
+                <w:sz w:val="16"/>
+              </w:rPr>
+              <w:t>艾卡批准独立规格与重新估算</w:t>
+            </w:r>
+          </w:p>
+        </w:tc>
+      </w:tr>
+      <w:tr>
+        <w:trPr>
+          <w:cantSplit w:val="true"/>
+        </w:trPr>
+        <w:tc>
+          <w:tcPr>
+            <w:tcW w:type="dxa" w:w="720"/>
+            <w:tcMar>
+              <w:top w:w="80" w:type="dxa"/>
+              <w:start w:w="120" w:type="dxa"/>
+              <w:bottom w:w="80" w:type="dxa"/>
+              <w:end w:w="120" w:type="dxa"/>
+            </w:tcMar>
+            <w:vAlign w:val="center"/>
+            <w:shd w:fill="F8FAFC"/>
+          </w:tcPr>
+          <w:p>
+            <w:pPr>
+              <w:spacing w:after="0" w:line="252" w:lineRule="auto"/>
+            </w:pPr>
+            <w:r>
+              <w:rPr>
+                <w:rFonts w:ascii="Microsoft YaHei" w:hAnsi="Microsoft YaHei" w:eastAsia="Microsoft YaHei"/>
+                <w:color w:val="1F1F1F"/>
+                <w:sz w:val="16"/>
+              </w:rPr>
+              <w:t>10</w:t>
+            </w:r>
+          </w:p>
+        </w:tc>
+        <w:tc>
+          <w:tcPr>
+            <w:tcW w:type="dxa" w:w="2300"/>
+            <w:tcMar>
+              <w:top w:w="80" w:type="dxa"/>
+              <w:start w:w="120" w:type="dxa"/>
+              <w:bottom w:w="80" w:type="dxa"/>
+              <w:end w:w="120" w:type="dxa"/>
+            </w:tcMar>
+            <w:vAlign w:val="center"/>
+            <w:shd w:fill="F8FAFC"/>
+          </w:tcPr>
+          <w:p>
+            <w:pPr>
+              <w:spacing w:after="0" w:line="252" w:lineRule="auto"/>
+            </w:pPr>
+            <w:r>
+              <w:rPr>
+                <w:rFonts w:ascii="Microsoft YaHei" w:hAnsi="Microsoft YaHei" w:eastAsia="Microsoft YaHei"/>
+                <w:color w:val="1F1F1F"/>
+                <w:sz w:val="16"/>
+              </w:rPr>
+              <w:t>Research后续批次</w:t>
+            </w:r>
+          </w:p>
+        </w:tc>
+        <w:tc>
+          <w:tcPr>
+            <w:tcW w:type="dxa" w:w="3400"/>
+            <w:tcMar>
+              <w:top w:w="80" w:type="dxa"/>
+              <w:start w:w="120" w:type="dxa"/>
+              <w:bottom w:w="80" w:type="dxa"/>
+              <w:end w:w="120" w:type="dxa"/>
+            </w:tcMar>
+            <w:vAlign w:val="center"/>
+            <w:shd w:fill="F8FAFC"/>
+          </w:tcPr>
+          <w:p>
+            <w:pPr>
+              <w:spacing w:after="0" w:line="252" w:lineRule="auto"/>
+            </w:pPr>
+            <w:r>
+              <w:rPr>
+                <w:rFonts w:ascii="Microsoft YaHei" w:hAnsi="Microsoft YaHei" w:eastAsia="Microsoft YaHei"/>
+                <w:color w:val="1F1F1F"/>
+                <w:sz w:val="16"/>
+              </w:rPr>
               <w:t>按批准后的R0–R3计划分批实施</w:t>
             </w:r>
           </w:p>
@@ -10450,6 +11641,7 @@
               <w:end w:w="120" w:type="dxa"/>
             </w:tcMar>
             <w:vAlign w:val="center"/>
+            <w:shd w:fill="F8FAFC"/>
           </w:tcPr>
           <w:p>
             <w:pPr>

</xml_diff>